<commit_message>
docs: correct the frontend row in the consolidated documentation
§18.1 still described the frontend as "plain HTML, CSS and JavaScript, no
build step", which stopped being true with the React port, and the backend row
pointed at frontend/ rather than frontend/dist/. Edited in place so the
embedded ER diagrams and the rest of the document are untouched.

Co-Authored-By: Claude Opus 5 <noreply@anthropic.com>
</commit_message>
<xml_diff>
--- a/docs/Karita_Project_Documentation.docx
+++ b/docs/Karita_Project_Documentation.docx
@@ -19296,7 +19296,7 @@
                 <w:sz w:val="20"/>
                 <w:szCs w:val="20"/>
               </w:rPr>
-              <w:t>Pages (HTML), styles/ and scripts/ — plain HTML, CSS and JavaScript, no build step</w:t>
+              <w:t>React 19 built by Vite — src/ (pages, components, lib), styles/, and ten HTML entry shells, one per page; npm run build emits dist/, which is what the backend serves</w:t>
             </w:r>
           </w:p>
         </w:tc>
@@ -19355,7 +19355,7 @@
                 <w:sz w:val="20"/>
                 <w:szCs w:val="20"/>
               </w:rPr>
-              <w:t>Spring Boot 4: PostgreSQL for core data, MongoDB for audit and notification documents, RabbitMQ for events; serves frontend/ and /api</w:t>
+              <w:t>Spring Boot 4: PostgreSQL for core data, MongoDB for audit and notification documents, RabbitMQ for events; serves frontend/dist/ and /api</w:t>
             </w:r>
           </w:p>
         </w:tc>

</xml_diff>